<commit_message>
Add DeepProctor UI/UX project with Figma embed
- New DeepProctor UI/UX project: dashboard for exam invigilators
- Figma interactive prototype embed on detail page
- Updated resume with DeepProctor entry
- Added update_resume.py to .gitignore

Co-Authored-By: Claude <noreply@anthropic.com>
</commit_message>
<xml_diff>
--- a/Safwan_Hanif_Resume.docx
+++ b/Safwan_Hanif_Resume.docx
@@ -752,6 +752,15 @@
         <w:t>Conversational UI patterns with memory indicators and confidence cues for AI assistant products.</w:t>
       </w:r>
     </w:p>
+    <w:p>
+      <w:r>
+        <w:rPr>
+          <w:rFonts w:ascii="Calibri" w:hAnsi="Calibri"/>
+          <w:sz w:val="20"/>
+        </w:rPr>
+        <w:t xml:space="preserve">DeepProctor: Designed a clean and modern dashboard for exam invigilators to monitor exams, track incidents, and manage sessions through an intuitive interface. Figma prototype included.</w:t>
+      </w:r>
+    </w:p>
     <w:p/>
     <w:p>
       <w:r>

</xml_diff>

<commit_message>
Add Cheezious App Redesign UI/UX practice project
- Cheezious App Redesign (Concept): improved navigation, menu
  browsing, and ordering experience with Figma prototype
- Added to resume under UI/UX projects

Co-Authored-By: Claude <noreply@anthropic.com>
</commit_message>
<xml_diff>
--- a/Safwan_Hanif_Resume.docx
+++ b/Safwan_Hanif_Resume.docx
@@ -612,6 +612,15 @@
       </w:r>
     </w:p>
     <w:p>
+      <w:r>
+        <w:rPr>
+          <w:rFonts w:ascii="Calibri" w:hAnsi="Calibri"/>
+          <w:sz w:val="20"/>
+        </w:rPr>
+        <w:t xml:space="preserve">Cheezious App Redesign (Concept): Redesigned the Cheezious mobile app as a UI/UX practice project, improving navigation, menu browsing, and the overall ordering experience. Figma prototype included.</w:t>
+      </w:r>
+    </w:p>
+    <w:p>
       <w:pPr>
         <w:pStyle w:val="ListParagraph"/>
       </w:pPr>

</xml_diff>

<commit_message>
Add uTorrent Mobile App Redesign UI/UX practice project
- uTorrent Mobile App Redesign: torrent downloading and file
  management UX improvements with Figma prototype
- Added to resume under UI/UX projects

Co-Authored-By: Claude <noreply@anthropic.com>
</commit_message>
<xml_diff>
--- a/Safwan_Hanif_Resume.docx
+++ b/Safwan_Hanif_Resume.docx
@@ -621,6 +621,15 @@
       </w:r>
     </w:p>
     <w:p>
+      <w:r>
+        <w:rPr>
+          <w:rFonts w:ascii="Calibri" w:hAnsi="Calibri"/>
+          <w:sz w:val="20"/>
+        </w:rPr>
+        <w:t xml:space="preserve">uTorrent Mobile App Redesign (Practice): Designed an improved mobile experience for torrent downloading and file management through user-centered UI/UX principles. Figma prototype included.</w:t>
+      </w:r>
+    </w:p>
+    <w:p>
       <w:pPr>
         <w:pStyle w:val="ListParagraph"/>
       </w:pPr>

</xml_diff>

<commit_message>
Remove Job Matching, AI Dashboard, and Chatbot Interface UI/UX projects
- Removed three UI/UX projects: Job Matching App, AI Dashboard
  Design, Chatbot Interface Design
- Updated resume to match (removed the same three entries)

Co-Authored-By: Claude <noreply@anthropic.com>
</commit_message>
<xml_diff>
--- a/Safwan_Hanif_Resume.docx
+++ b/Safwan_Hanif_Resume.docx
@@ -699,26 +699,6 @@
           <w:b/>
           <w:sz w:val="22"/>
         </w:rPr>
-        <w:t xml:space="preserve">Job Matching App: </w:t>
-      </w:r>
-      <w:r>
-        <w:rPr>
-          <w:rFonts w:ascii="Times" w:hAnsi="Times"/>
-          <w:sz w:val="22"/>
-        </w:rPr>
-        <w:t>Tinder-style swipe interface for matching job seekers with roles, designed in Figma.</w:t>
-      </w:r>
-    </w:p>
-    <w:p>
-      <w:pPr>
-        <w:pStyle w:val="ListParagraph"/>
-      </w:pPr>
-      <w:r>
-        <w:rPr>
-          <w:rFonts w:ascii="Times" w:hAnsi="Times"/>
-          <w:b/>
-          <w:sz w:val="22"/>
-        </w:rPr>
         <w:t xml:space="preserve">Home Service Marketplace: </w:t>
       </w:r>
       <w:r>
@@ -727,46 +707,6 @@
           <w:sz w:val="22"/>
         </w:rPr>
         <w:t>Booking platform connecting users with local service providers, with complete design system.</w:t>
-      </w:r>
-    </w:p>
-    <w:p>
-      <w:pPr>
-        <w:pStyle w:val="ListParagraph"/>
-      </w:pPr>
-      <w:r>
-        <w:rPr>
-          <w:rFonts w:ascii="Times" w:hAnsi="Times"/>
-          <w:b/>
-          <w:sz w:val="22"/>
-        </w:rPr>
-        <w:t xml:space="preserve">AI Dashboard Design: </w:t>
-      </w:r>
-      <w:r>
-        <w:rPr>
-          <w:rFonts w:ascii="Times" w:hAnsi="Times"/>
-          <w:sz w:val="22"/>
-        </w:rPr>
-        <w:t>Data-dense dashboard UI for monitoring AI model performance and usage metrics.</w:t>
-      </w:r>
-    </w:p>
-    <w:p>
-      <w:pPr>
-        <w:pStyle w:val="ListParagraph"/>
-      </w:pPr>
-      <w:r>
-        <w:rPr>
-          <w:rFonts w:ascii="Times" w:hAnsi="Times"/>
-          <w:b/>
-          <w:sz w:val="22"/>
-        </w:rPr>
-        <w:t xml:space="preserve">Chatbot Interface Design: </w:t>
-      </w:r>
-      <w:r>
-        <w:rPr>
-          <w:rFonts w:ascii="Times" w:hAnsi="Times"/>
-          <w:sz w:val="22"/>
-        </w:rPr>
-        <w:t>Conversational UI patterns with memory indicators and confidence cues for AI assistant products.</w:t>
       </w:r>
     </w:p>
     <w:p>

</xml_diff>